<commit_message>
docs: resync Word cure_arrogance
Co-Authored-By: Claude Opus 4.6 (1M context) <noreply@anthropic.com>
</commit_message>
<xml_diff>
--- a/ECRITS_NIYYAH/cure_arrogance.docx
+++ b/ECRITS_NIYYAH/cure_arrogance.docx
@@ -1268,19 +1268,19 @@
           <w:sz w:val="22"/>
           <w:szCs w:val="22"/>
         </w:rPr>
-        <w:t xml:space="preserve">Rapporté dans les recueils de zuhd (formulation à confirmer)</w:t>
-      </w:r>
-    </w:p>
-    <w:p>
-      <w:pPr>
-        <w:spacing w:after="120"/>
-      </w:pPr>
-      <w:r>
-        <w:rPr>
-          <w:sz w:val="22"/>
-          <w:szCs w:val="22"/>
-        </w:rPr>
-        <w:t xml:space="preserve">Le grand prédicateur de Basra ramène l'homme à sa vérité de passage. Tu n'es pas un monument, tu es un passage. À soumettre à l'imam pour la formulation.</w:t>
+        <w:t xml:space="preserve">Rapporté par Ahmad (Az-Zuhd) et Abû Nu'aym (Hilyat al-awliyâ')</w:t>
+      </w:r>
+    </w:p>
+    <w:p>
+      <w:pPr>
+        <w:spacing w:after="120"/>
+      </w:pPr>
+      <w:r>
+        <w:rPr>
+          <w:sz w:val="22"/>
+          <w:szCs w:val="22"/>
+        </w:rPr>
+        <w:t xml:space="preserve">Le grand prédicateur de Basra ramène l'homme à sa vérité de passage. Tu n'es pas un monument, tu es un passage.</w:t>
       </w:r>
     </w:p>
     <w:p>
@@ -1365,7 +1365,7 @@
           <w:sz w:val="22"/>
           <w:szCs w:val="22"/>
         </w:rPr>
-        <w:t xml:space="preserve">[Psy] Saillance de la mortalité (Terror Management Theory) : la conscience de la finitude, vécue avec sens et non comme menace, réduit la quête de statut et réaligne sur les valeurs.</w:t>
+        <w:t xml:space="preserve">[Psy] Réflexion contemplative sur la finitude (death reflection, Cozzolino) : vécue avec sens et non comme menace, elle réduit la quête de statut et réaligne sur les valeurs intrinsèques — à l'inverse de la simple peur de la mort (TMT), qui la renforce.</w:t>
       </w:r>
     </w:p>
     <w:p>
@@ -1850,7 +1850,7 @@
           <w:sz w:val="22"/>
           <w:szCs w:val="22"/>
         </w:rPr>
-        <w:t xml:space="preserve">[Psy] Dissonance cognitive &amp; backfire effect (TCC) : avouer une erreur menace l'image de soi, d'où la résistance physique. Nommer la réaction la désamorce.</w:t>
+        <w:t xml:space="preserve">[Psy] Dissonance cognitive (TCC) : avouer une erreur menace l'image de soi, d'où la résistance physique. Nommer la réaction la désamorce.</w:t>
       </w:r>
     </w:p>
     <w:p>

</xml_diff>

<commit_message>
docs: resync Word cure_arrogance j4
Co-Authored-By: Claude Opus 4.6 (1M context) <noreply@anthropic.com>
</commit_message>
<xml_diff>
--- a/ECRITS_NIYYAH/cure_arrogance.docx
+++ b/ECRITS_NIYYAH/cure_arrogance.docx
@@ -1767,19 +1767,19 @@
           <w:sz w:val="22"/>
           <w:szCs w:val="22"/>
         </w:rPr>
-        <w:t xml:space="preserve">Récit célèbre (lié à l'épisode de la dot) — chaîne débattue, à confirmer</w:t>
-      </w:r>
-    </w:p>
-    <w:p>
-      <w:pPr>
-        <w:spacing w:after="120"/>
-      </w:pPr>
-      <w:r>
-        <w:rPr>
-          <w:sz w:val="22"/>
-          <w:szCs w:val="22"/>
-        </w:rPr>
-        <w:t xml:space="preserve">Le deuxième homme de l'islam après le Prophète ﷺ, devant tous, donnant raison à une inconnue : la force réelle n'est pas d'avoir toujours raison, mais de ne pas avoir besoin d'avoir raison. Formulation à soumettre à l'imam ; alternative prête si rejet.</w:t>
+        <w:t xml:space="preserve">Récit d'adab largement transmis (épisode du plafonnement de la dot) — chaînes faibles, cité pour l'édification</w:t>
+      </w:r>
+    </w:p>
+    <w:p>
+      <w:pPr>
+        <w:spacing w:after="120"/>
+      </w:pPr>
+      <w:r>
+        <w:rPr>
+          <w:sz w:val="22"/>
+          <w:szCs w:val="22"/>
+        </w:rPr>
+        <w:t xml:space="preserve">Le deuxième homme de l'islam après le Prophète ﷺ, devant tous, donnant raison à une inconnue : la force réelle n'est pas d'avoir toujours raison, mais de ne pas avoir besoin d'avoir raison.</w:t>
       </w:r>
     </w:p>
     <w:p>

</xml_diff>

<commit_message>
docs: resync Word apres nettoyage residus
Co-Authored-By: Claude Opus 4.6 (1M context) <noreply@anthropic.com>
</commit_message>
<xml_diff>
--- a/ECRITS_NIYYAH/cure_arrogance.docx
+++ b/ECRITS_NIYYAH/cure_arrogance.docx
@@ -411,7 +411,7 @@
           <w:sz w:val="22"/>
           <w:szCs w:val="22"/>
         </w:rPr>
-        <w:t xml:space="preserve">Source : Ahmad — hasan (à confirmer à l'imam)</w:t>
+        <w:t xml:space="preserve">Source : Adab al-Mufrad 716 (sahîh, al-Albânî) ; Ahmad</w:t>
       </w:r>
     </w:p>
     <w:p>
@@ -737,7 +737,7 @@
           <w:sz w:val="22"/>
           <w:szCs w:val="22"/>
         </w:rPr>
-        <w:t xml:space="preserve">Il préfère le péché suivi du regret à l'adoration suivie du 'ujb — parce que le regret rapproche d'Allah, et l'auto-admiration éloigne, en faisant croire qu'on est déjà arrivé. Formulation à confirmer à l'imam.</w:t>
+        <w:t xml:space="preserve">Il préfère le péché suivi du regret à l'adoration suivie du 'ujb — parce que le regret rapproche d'Allah, et l'auto-admiration éloigne, en faisant croire qu'on est déjà arrivé.</w:t>
       </w:r>
     </w:p>
     <w:p>

</xml_diff>